<commit_message>
Exhibits: RegMap-reusable (11A), Assessment Tool (18), refresh 15
- Exhibit 11A — RegMap as a reusable, published model (packaged Apache-2.0,
  reused across the platform for control mapping + interview interpretation).
- Exhibit 18 — Vulnerability-to-Compliance Assessment Tool (discovery →
  CVE/KEV/EPSS prioritization → NIST 800-53 → reports; agent + Nessus/OpenVAS
  ingest; orchestrate-and-ingest framing).
- Exhibit 15 — refreshed with the platform expansion since submission
  (decisioning platform, case management, assessment tool, RegMap release).
</commit_message>
<xml_diff>
--- a/exhibits/Exhibit 15 Research Progress and Body of Work.docx
+++ b/exhibits/Exhibit 15 Research Progress and Body of Work.docx
@@ -974,12 +974,61 @@
       </w:r>
     </w:p>
     <w:p>
+      <w:pPr>
+        <w:pStyle w:val="Heading1"/>
+      </w:pPr>
+      <w:r>
+        <w:t>Continued Progress Since Submission: An Operational Platform</w:t>
+      </w:r>
+    </w:p>
+    <w:p>
       <w:r>
         <w:rPr>
           <w:b w:val="0"/>
           <w:i w:val="0"/>
         </w:rPr>
-        <w:t>This exhibit should be read alongside Exhibits 11–14, which document the individual prototypes and their live validation in detail, and alongside my publication record and personal statement.</w:t>
+        <w:t>Since submitting the three manuscripts, I have continued the endeavor by building the prototypes into a single operational security platform, all publicly reproducible:</w:t>
+      </w:r>
+    </w:p>
+    <w:p>
+      <w:pPr>
+        <w:pStyle w:val="ListBullet"/>
+      </w:pPr>
+      <w:r>
+        <w:t>Real-time decisioning platform — the detectors now Record every decision, Decide via a policy engine, Act with auditable responses, and produce AI-assisted triage (Exhibit 16).</w:t>
+      </w:r>
+    </w:p>
+    <w:p>
+      <w:pPr>
+        <w:pStyle w:val="ListBullet"/>
+      </w:pPr>
+      <w:r>
+        <w:t>Analyst case-management workflow — a human-in-the-loop console where resolving an alert feeds ground truth back to improve future decisions (Exhibit 17).</w:t>
+      </w:r>
+    </w:p>
+    <w:p>
+      <w:pPr>
+        <w:pStyle w:val="ListBullet"/>
+      </w:pPr>
+      <w:r>
+        <w:t>Vulnerability-to-compliance assessment tool — one workflow from asset discovery and exploit-aware vulnerability prioritization (CVE + CISA KEV + EPSS) to NIST SP 800-53 control recommendations and reports, including an on-prem scan agent and ingestion of Nessus/OpenVAS output (Exhibit 18).</w:t>
+      </w:r>
+    </w:p>
+    <w:p>
+      <w:pPr>
+        <w:pStyle w:val="ListBullet"/>
+      </w:pPr>
+      <w:r>
+        <w:t>RegMap released as a reusable, openly-licensed model and reused as a component across the platform (Exhibit 11A).</w:t>
+      </w:r>
+    </w:p>
+    <w:p>
+      <w:r>
+        <w:rPr>
+          <w:b w:val="0"/>
+          <w:i w:val="0"/>
+        </w:rPr>
+        <w:t>This exhibit should be read alongside Exhibits 11–18, which document the individual prototypes, their live validation, and their consolidation into an operational platform, and alongside my publication record and personal statement.</w:t>
       </w:r>
     </w:p>
     <w:p>

</xml_diff>